<commit_message>
docs: adiciona seção de verificação e validação (V&V)
</commit_message>
<xml_diff>
--- a/docs/documentacao.docx
+++ b/docs/documentacao.docx
@@ -7298,6 +7298,1418 @@
           <w:szCs w:val="24"/>
         </w:rPr>
         <w:lastRenderedPageBreak/>
+        <w:t>VERIFICAÇÃO E VALIDAÇÃO DO SISTEMA</w:t>
+      </w:r>
+    </w:p>
+    <w:p>
+      <w:pPr>
+        <w:spacing w:line="360" w:lineRule="auto"/>
+        <w:ind w:firstLine="709"/>
+        <w:jc w:val="both"/>
+        <w:rPr>
+          <w:rFonts w:ascii="Times New Roman" w:hAnsi="Times New Roman" w:cs="Times New Roman"/>
+          <w:color w:val="000000" w:themeColor="text1"/>
+          <w:sz w:val="24"/>
+          <w:szCs w:val="24"/>
+        </w:rPr>
+      </w:pPr>
+    </w:p>
+    <w:p>
+      <w:pPr>
+        <w:spacing w:line="360" w:lineRule="auto"/>
+        <w:ind w:firstLine="709"/>
+        <w:jc w:val="both"/>
+        <w:rPr>
+          <w:rFonts w:ascii="Times New Roman" w:hAnsi="Times New Roman" w:cs="Times New Roman"/>
+          <w:b/>
+          <w:bCs/>
+          <w:color w:val="000000" w:themeColor="text1"/>
+          <w:sz w:val="24"/>
+          <w:szCs w:val="24"/>
+        </w:rPr>
+      </w:pPr>
+      <w:r>
+        <w:rPr>
+          <w:rFonts w:ascii="Times New Roman" w:hAnsi="Times New Roman" w:cs="Times New Roman"/>
+          <w:b/>
+          <w:bCs/>
+          <w:color w:val="000000" w:themeColor="text1"/>
+          <w:sz w:val="24"/>
+          <w:szCs w:val="24"/>
+        </w:rPr>
+        <w:t>Introdução aos Testes</w:t>
+      </w:r>
+    </w:p>
+    <w:p>
+      <w:pPr>
+        <w:spacing w:line="360" w:lineRule="auto"/>
+        <w:ind w:firstLine="709"/>
+        <w:jc w:val="both"/>
+        <w:rPr>
+          <w:rFonts w:ascii="Times New Roman" w:hAnsi="Times New Roman" w:cs="Times New Roman"/>
+          <w:color w:val="000000" w:themeColor="text1"/>
+          <w:sz w:val="24"/>
+          <w:szCs w:val="24"/>
+        </w:rPr>
+      </w:pPr>
+    </w:p>
+    <w:p>
+      <w:pPr>
+        <w:spacing w:line="360" w:lineRule="auto"/>
+        <w:ind w:firstLine="709"/>
+        <w:jc w:val="both"/>
+        <w:rPr>
+          <w:rFonts w:ascii="Times New Roman" w:hAnsi="Times New Roman" w:cs="Times New Roman"/>
+          <w:color w:val="000000" w:themeColor="text1"/>
+          <w:sz w:val="24"/>
+          <w:szCs w:val="24"/>
+        </w:rPr>
+      </w:pPr>
+      <w:r>
+        <w:rPr>
+          <w:rFonts w:ascii="Times New Roman" w:hAnsi="Times New Roman" w:cs="Times New Roman"/>
+          <w:color w:val="000000" w:themeColor="text1"/>
+          <w:sz w:val="24"/>
+          <w:szCs w:val="24"/>
+        </w:rPr>
+        <w:t>A verificação e validação (V&amp;V) do Sistema de Reserva de Salas têm como objetivo garantir que o software desenvolvido atenda aos requisitos especificados, funcione corretamente e ofereça qualidade, confiabilidade e segurança aos usuários.</w:t>
+      </w:r>
+    </w:p>
+    <w:p>
+      <w:pPr>
+        <w:spacing w:line="360" w:lineRule="auto"/>
+        <w:ind w:firstLine="709"/>
+        <w:jc w:val="both"/>
+        <w:rPr>
+          <w:rFonts w:ascii="Times New Roman" w:hAnsi="Times New Roman" w:cs="Times New Roman"/>
+          <w:color w:val="000000" w:themeColor="text1"/>
+          <w:sz w:val="24"/>
+          <w:szCs w:val="24"/>
+        </w:rPr>
+      </w:pPr>
+      <w:r>
+        <w:rPr>
+          <w:rFonts w:ascii="Times New Roman" w:hAnsi="Times New Roman" w:cs="Times New Roman"/>
+          <w:color w:val="000000" w:themeColor="text1"/>
+          <w:sz w:val="24"/>
+          <w:szCs w:val="24"/>
+        </w:rPr>
+        <w:t>A verificação consiste em assegurar que o sistema foi construído corretamente, seguindo as especificações definidas, enquanto a validação busca confirmar que o sistema atende às necessidades reais dos usuários.</w:t>
+      </w:r>
+    </w:p>
+    <w:p>
+      <w:pPr>
+        <w:spacing w:line="360" w:lineRule="auto"/>
+        <w:ind w:firstLine="709"/>
+        <w:jc w:val="both"/>
+        <w:rPr>
+          <w:rFonts w:ascii="Times New Roman" w:hAnsi="Times New Roman" w:cs="Times New Roman"/>
+          <w:color w:val="000000" w:themeColor="text1"/>
+          <w:sz w:val="24"/>
+          <w:szCs w:val="24"/>
+        </w:rPr>
+      </w:pPr>
+      <w:r>
+        <w:rPr>
+          <w:rFonts w:ascii="Times New Roman" w:hAnsi="Times New Roman" w:cs="Times New Roman"/>
+          <w:color w:val="000000" w:themeColor="text1"/>
+          <w:sz w:val="24"/>
+          <w:szCs w:val="24"/>
+        </w:rPr>
+        <w:t>Nesse contexto, a aplicação de testes ao longo do desenvolvimento é fundamental para identificar falhas, prevenir erros em produção e garantir o correto funcionamento das funcionalidades implementadas.</w:t>
+      </w:r>
+    </w:p>
+    <w:p>
+      <w:pPr>
+        <w:spacing w:line="360" w:lineRule="auto"/>
+        <w:ind w:firstLine="709"/>
+        <w:jc w:val="both"/>
+        <w:rPr>
+          <w:rFonts w:ascii="Times New Roman" w:hAnsi="Times New Roman" w:cs="Times New Roman"/>
+          <w:color w:val="000000" w:themeColor="text1"/>
+          <w:sz w:val="24"/>
+          <w:szCs w:val="24"/>
+        </w:rPr>
+      </w:pPr>
+    </w:p>
+    <w:p>
+      <w:pPr>
+        <w:spacing w:line="360" w:lineRule="auto"/>
+        <w:ind w:firstLine="709"/>
+        <w:jc w:val="both"/>
+        <w:rPr>
+          <w:rFonts w:ascii="Times New Roman" w:hAnsi="Times New Roman" w:cs="Times New Roman"/>
+          <w:b/>
+          <w:bCs/>
+          <w:color w:val="000000" w:themeColor="text1"/>
+          <w:sz w:val="24"/>
+          <w:szCs w:val="24"/>
+        </w:rPr>
+      </w:pPr>
+      <w:r>
+        <w:rPr>
+          <w:rFonts w:ascii="Times New Roman" w:hAnsi="Times New Roman" w:cs="Times New Roman"/>
+          <w:b/>
+          <w:bCs/>
+          <w:color w:val="000000" w:themeColor="text1"/>
+          <w:sz w:val="24"/>
+          <w:szCs w:val="24"/>
+        </w:rPr>
+        <w:t>Ciclo de Vida de Verificação</w:t>
+      </w:r>
+    </w:p>
+    <w:p>
+      <w:pPr>
+        <w:spacing w:line="360" w:lineRule="auto"/>
+        <w:ind w:firstLine="709"/>
+        <w:jc w:val="both"/>
+        <w:rPr>
+          <w:rFonts w:ascii="Times New Roman" w:hAnsi="Times New Roman" w:cs="Times New Roman"/>
+          <w:color w:val="000000" w:themeColor="text1"/>
+          <w:sz w:val="24"/>
+          <w:szCs w:val="24"/>
+        </w:rPr>
+      </w:pPr>
+    </w:p>
+    <w:p>
+      <w:pPr>
+        <w:spacing w:line="360" w:lineRule="auto"/>
+        <w:ind w:firstLine="709"/>
+        <w:jc w:val="both"/>
+        <w:rPr>
+          <w:rFonts w:ascii="Times New Roman" w:hAnsi="Times New Roman" w:cs="Times New Roman"/>
+          <w:color w:val="000000" w:themeColor="text1"/>
+          <w:sz w:val="24"/>
+          <w:szCs w:val="24"/>
+        </w:rPr>
+      </w:pPr>
+      <w:r>
+        <w:rPr>
+          <w:rFonts w:ascii="Times New Roman" w:hAnsi="Times New Roman" w:cs="Times New Roman"/>
+          <w:color w:val="000000" w:themeColor="text1"/>
+          <w:sz w:val="24"/>
+          <w:szCs w:val="24"/>
+        </w:rPr>
+        <w:t>O processo de verificação do sistema foi conduzido com base nas etapas do ciclo de vida de testes, alinhado ao modelo de desenvolvimento em cascata adotado no projeto.</w:t>
+      </w:r>
+    </w:p>
+    <w:p>
+      <w:pPr>
+        <w:spacing w:line="360" w:lineRule="auto"/>
+        <w:ind w:firstLine="709"/>
+        <w:jc w:val="both"/>
+        <w:rPr>
+          <w:rFonts w:ascii="Times New Roman" w:hAnsi="Times New Roman" w:cs="Times New Roman"/>
+          <w:color w:val="000000" w:themeColor="text1"/>
+          <w:sz w:val="24"/>
+          <w:szCs w:val="24"/>
+        </w:rPr>
+      </w:pPr>
+      <w:r>
+        <w:rPr>
+          <w:rFonts w:ascii="Times New Roman" w:hAnsi="Times New Roman" w:cs="Times New Roman"/>
+          <w:color w:val="000000" w:themeColor="text1"/>
+          <w:sz w:val="24"/>
+          <w:szCs w:val="24"/>
+        </w:rPr>
+        <w:t>As principais etapas consideradas foram:</w:t>
+      </w:r>
+    </w:p>
+    <w:p>
+      <w:pPr>
+        <w:spacing w:line="360" w:lineRule="auto"/>
+        <w:ind w:firstLine="709"/>
+        <w:jc w:val="both"/>
+        <w:rPr>
+          <w:rFonts w:ascii="Times New Roman" w:hAnsi="Times New Roman" w:cs="Times New Roman"/>
+          <w:color w:val="000000" w:themeColor="text1"/>
+          <w:sz w:val="24"/>
+          <w:szCs w:val="24"/>
+        </w:rPr>
+      </w:pPr>
+      <w:r>
+        <w:rPr>
+          <w:rFonts w:ascii="Times New Roman" w:hAnsi="Times New Roman" w:cs="Times New Roman"/>
+          <w:color w:val="000000" w:themeColor="text1"/>
+          <w:sz w:val="24"/>
+          <w:szCs w:val="24"/>
+        </w:rPr>
+        <w:t>Levantamento de Requisitos: Base para definição dos testes, utilizando os requisitos funcionais e não funcionais já especificados neste documento.</w:t>
+      </w:r>
+    </w:p>
+    <w:p>
+      <w:pPr>
+        <w:spacing w:line="360" w:lineRule="auto"/>
+        <w:ind w:firstLine="709"/>
+        <w:jc w:val="both"/>
+        <w:rPr>
+          <w:rFonts w:ascii="Times New Roman" w:hAnsi="Times New Roman" w:cs="Times New Roman"/>
+          <w:color w:val="000000" w:themeColor="text1"/>
+          <w:sz w:val="24"/>
+          <w:szCs w:val="24"/>
+        </w:rPr>
+      </w:pPr>
+      <w:r>
+        <w:rPr>
+          <w:rFonts w:ascii="Times New Roman" w:hAnsi="Times New Roman" w:cs="Times New Roman"/>
+          <w:color w:val="000000" w:themeColor="text1"/>
+          <w:sz w:val="24"/>
+          <w:szCs w:val="24"/>
+        </w:rPr>
+        <w:t>Planejamento de Testes: Definição do escopo, objetivos e estratégias de teste a serem aplicadas.</w:t>
+      </w:r>
+    </w:p>
+    <w:p>
+      <w:pPr>
+        <w:spacing w:line="360" w:lineRule="auto"/>
+        <w:ind w:firstLine="709"/>
+        <w:jc w:val="both"/>
+        <w:rPr>
+          <w:rFonts w:ascii="Times New Roman" w:hAnsi="Times New Roman" w:cs="Times New Roman"/>
+          <w:color w:val="000000" w:themeColor="text1"/>
+          <w:sz w:val="24"/>
+          <w:szCs w:val="24"/>
+        </w:rPr>
+      </w:pPr>
+      <w:r>
+        <w:rPr>
+          <w:rFonts w:ascii="Times New Roman" w:hAnsi="Times New Roman" w:cs="Times New Roman"/>
+          <w:color w:val="000000" w:themeColor="text1"/>
+          <w:sz w:val="24"/>
+          <w:szCs w:val="24"/>
+        </w:rPr>
+        <w:t>Projeto de Testes: Elaboração dos casos de teste com base nas funcionalidades do sistema.</w:t>
+      </w:r>
+    </w:p>
+    <w:p>
+      <w:pPr>
+        <w:spacing w:line="360" w:lineRule="auto"/>
+        <w:ind w:firstLine="709"/>
+        <w:jc w:val="both"/>
+        <w:rPr>
+          <w:rFonts w:ascii="Times New Roman" w:hAnsi="Times New Roman" w:cs="Times New Roman"/>
+          <w:color w:val="000000" w:themeColor="text1"/>
+          <w:sz w:val="24"/>
+          <w:szCs w:val="24"/>
+        </w:rPr>
+      </w:pPr>
+      <w:r>
+        <w:rPr>
+          <w:rFonts w:ascii="Times New Roman" w:hAnsi="Times New Roman" w:cs="Times New Roman"/>
+          <w:color w:val="000000" w:themeColor="text1"/>
+          <w:sz w:val="24"/>
+          <w:szCs w:val="24"/>
+        </w:rPr>
+        <w:t>Implementação dos Testes: Desenvolvimento dos testes unitários para validação das regras de negócio.</w:t>
+      </w:r>
+    </w:p>
+    <w:p>
+      <w:pPr>
+        <w:spacing w:line="360" w:lineRule="auto"/>
+        <w:ind w:firstLine="709"/>
+        <w:jc w:val="both"/>
+        <w:rPr>
+          <w:rFonts w:ascii="Times New Roman" w:hAnsi="Times New Roman" w:cs="Times New Roman"/>
+          <w:color w:val="000000" w:themeColor="text1"/>
+          <w:sz w:val="24"/>
+          <w:szCs w:val="24"/>
+        </w:rPr>
+      </w:pPr>
+      <w:r>
+        <w:rPr>
+          <w:rFonts w:ascii="Times New Roman" w:hAnsi="Times New Roman" w:cs="Times New Roman"/>
+          <w:color w:val="000000" w:themeColor="text1"/>
+          <w:sz w:val="24"/>
+          <w:szCs w:val="24"/>
+        </w:rPr>
+        <w:lastRenderedPageBreak/>
+        <w:t>Execução dos Testes: Realização dos testes e verificação dos resultados obtidos.</w:t>
+      </w:r>
+    </w:p>
+    <w:p>
+      <w:pPr>
+        <w:spacing w:line="360" w:lineRule="auto"/>
+        <w:ind w:firstLine="709"/>
+        <w:jc w:val="both"/>
+        <w:rPr>
+          <w:rFonts w:ascii="Times New Roman" w:hAnsi="Times New Roman" w:cs="Times New Roman"/>
+          <w:color w:val="000000" w:themeColor="text1"/>
+          <w:sz w:val="24"/>
+          <w:szCs w:val="24"/>
+        </w:rPr>
+      </w:pPr>
+      <w:r>
+        <w:rPr>
+          <w:rFonts w:ascii="Times New Roman" w:hAnsi="Times New Roman" w:cs="Times New Roman"/>
+          <w:color w:val="000000" w:themeColor="text1"/>
+          <w:sz w:val="24"/>
+          <w:szCs w:val="24"/>
+        </w:rPr>
+        <w:t>Análise dos Resultados: Avaliação da qualidade do sistema com base nos testes executados.</w:t>
+      </w:r>
+    </w:p>
+    <w:p>
+      <w:pPr>
+        <w:spacing w:line="360" w:lineRule="auto"/>
+        <w:ind w:firstLine="709"/>
+        <w:jc w:val="both"/>
+        <w:rPr>
+          <w:rFonts w:ascii="Times New Roman" w:hAnsi="Times New Roman" w:cs="Times New Roman"/>
+          <w:color w:val="000000" w:themeColor="text1"/>
+          <w:sz w:val="24"/>
+          <w:szCs w:val="24"/>
+        </w:rPr>
+      </w:pPr>
+      <w:r>
+        <w:rPr>
+          <w:rFonts w:ascii="Times New Roman" w:hAnsi="Times New Roman" w:cs="Times New Roman"/>
+          <w:color w:val="000000" w:themeColor="text1"/>
+          <w:sz w:val="24"/>
+          <w:szCs w:val="24"/>
+        </w:rPr>
+        <w:t>Esse processo garante uma abordagem estruturada, permitindo maior controle sobre a qualidade do software.</w:t>
+      </w:r>
+    </w:p>
+    <w:p>
+      <w:pPr>
+        <w:spacing w:line="360" w:lineRule="auto"/>
+        <w:ind w:firstLine="709"/>
+        <w:jc w:val="both"/>
+        <w:rPr>
+          <w:rFonts w:ascii="Times New Roman" w:hAnsi="Times New Roman" w:cs="Times New Roman"/>
+          <w:color w:val="000000" w:themeColor="text1"/>
+          <w:sz w:val="24"/>
+          <w:szCs w:val="24"/>
+        </w:rPr>
+      </w:pPr>
+    </w:p>
+    <w:p>
+      <w:pPr>
+        <w:spacing w:line="360" w:lineRule="auto"/>
+        <w:ind w:firstLine="709"/>
+        <w:jc w:val="both"/>
+        <w:rPr>
+          <w:rFonts w:ascii="Times New Roman" w:hAnsi="Times New Roman" w:cs="Times New Roman"/>
+          <w:b/>
+          <w:bCs/>
+          <w:color w:val="000000" w:themeColor="text1"/>
+          <w:sz w:val="24"/>
+          <w:szCs w:val="24"/>
+        </w:rPr>
+      </w:pPr>
+      <w:r>
+        <w:rPr>
+          <w:rFonts w:ascii="Times New Roman" w:hAnsi="Times New Roman" w:cs="Times New Roman"/>
+          <w:b/>
+          <w:bCs/>
+          <w:color w:val="000000" w:themeColor="text1"/>
+          <w:sz w:val="24"/>
+          <w:szCs w:val="24"/>
+        </w:rPr>
+        <w:t>Planejamento de Testes</w:t>
+      </w:r>
+    </w:p>
+    <w:p>
+      <w:pPr>
+        <w:spacing w:line="360" w:lineRule="auto"/>
+        <w:ind w:firstLine="709"/>
+        <w:jc w:val="both"/>
+        <w:rPr>
+          <w:rFonts w:ascii="Times New Roman" w:hAnsi="Times New Roman" w:cs="Times New Roman"/>
+          <w:color w:val="000000" w:themeColor="text1"/>
+          <w:sz w:val="24"/>
+          <w:szCs w:val="24"/>
+        </w:rPr>
+      </w:pPr>
+    </w:p>
+    <w:p>
+      <w:pPr>
+        <w:spacing w:line="360" w:lineRule="auto"/>
+        <w:ind w:firstLine="709"/>
+        <w:jc w:val="both"/>
+        <w:rPr>
+          <w:rFonts w:ascii="Times New Roman" w:hAnsi="Times New Roman" w:cs="Times New Roman"/>
+          <w:color w:val="000000" w:themeColor="text1"/>
+          <w:sz w:val="24"/>
+          <w:szCs w:val="24"/>
+        </w:rPr>
+      </w:pPr>
+      <w:r>
+        <w:rPr>
+          <w:rFonts w:ascii="Times New Roman" w:hAnsi="Times New Roman" w:cs="Times New Roman"/>
+          <w:color w:val="000000" w:themeColor="text1"/>
+          <w:sz w:val="24"/>
+          <w:szCs w:val="24"/>
+        </w:rPr>
+        <w:t>O planejamento de testes foi definido com o objetivo de validar as principais funcionalidades do sistema, assegurando que os requisitos sejam atendidos corretamente.</w:t>
+      </w:r>
+    </w:p>
+    <w:p>
+      <w:pPr>
+        <w:spacing w:line="360" w:lineRule="auto"/>
+        <w:ind w:firstLine="709"/>
+        <w:jc w:val="both"/>
+        <w:rPr>
+          <w:rFonts w:ascii="Times New Roman" w:hAnsi="Times New Roman" w:cs="Times New Roman"/>
+          <w:color w:val="000000" w:themeColor="text1"/>
+          <w:sz w:val="24"/>
+          <w:szCs w:val="24"/>
+        </w:rPr>
+      </w:pPr>
+    </w:p>
+    <w:p>
+      <w:pPr>
+        <w:spacing w:line="360" w:lineRule="auto"/>
+        <w:ind w:firstLine="709"/>
+        <w:jc w:val="both"/>
+        <w:rPr>
+          <w:rFonts w:ascii="Times New Roman" w:hAnsi="Times New Roman" w:cs="Times New Roman"/>
+          <w:color w:val="000000" w:themeColor="text1"/>
+          <w:sz w:val="24"/>
+          <w:szCs w:val="24"/>
+        </w:rPr>
+      </w:pPr>
+      <w:r>
+        <w:rPr>
+          <w:rFonts w:ascii="Times New Roman" w:hAnsi="Times New Roman" w:cs="Times New Roman"/>
+          <w:color w:val="000000" w:themeColor="text1"/>
+          <w:sz w:val="24"/>
+          <w:szCs w:val="24"/>
+        </w:rPr>
+        <w:t>O</w:t>
+      </w:r>
+      <w:r>
+        <w:rPr>
+          <w:rFonts w:ascii="Times New Roman" w:hAnsi="Times New Roman" w:cs="Times New Roman"/>
+          <w:color w:val="000000" w:themeColor="text1"/>
+          <w:sz w:val="24"/>
+          <w:szCs w:val="24"/>
+        </w:rPr>
+        <w:t xml:space="preserve"> </w:t>
+      </w:r>
+      <w:r>
+        <w:rPr>
+          <w:rFonts w:ascii="Times New Roman" w:hAnsi="Times New Roman" w:cs="Times New Roman"/>
+          <w:color w:val="000000" w:themeColor="text1"/>
+          <w:sz w:val="24"/>
+          <w:szCs w:val="24"/>
+        </w:rPr>
+        <w:t>escopo dos testes inclui:</w:t>
+      </w:r>
+    </w:p>
+    <w:p>
+      <w:pPr>
+        <w:spacing w:line="360" w:lineRule="auto"/>
+        <w:ind w:firstLine="709"/>
+        <w:jc w:val="both"/>
+        <w:rPr>
+          <w:rFonts w:ascii="Times New Roman" w:hAnsi="Times New Roman" w:cs="Times New Roman"/>
+          <w:color w:val="000000" w:themeColor="text1"/>
+          <w:sz w:val="24"/>
+          <w:szCs w:val="24"/>
+        </w:rPr>
+      </w:pPr>
+      <w:r>
+        <w:rPr>
+          <w:rFonts w:ascii="Times New Roman" w:hAnsi="Times New Roman" w:cs="Times New Roman"/>
+          <w:color w:val="000000" w:themeColor="text1"/>
+          <w:sz w:val="24"/>
+          <w:szCs w:val="24"/>
+        </w:rPr>
+        <w:t>Cadastro e autenticação de usuários</w:t>
+      </w:r>
+    </w:p>
+    <w:p>
+      <w:pPr>
+        <w:spacing w:line="360" w:lineRule="auto"/>
+        <w:ind w:firstLine="709"/>
+        <w:jc w:val="both"/>
+        <w:rPr>
+          <w:rFonts w:ascii="Times New Roman" w:hAnsi="Times New Roman" w:cs="Times New Roman"/>
+          <w:color w:val="000000" w:themeColor="text1"/>
+          <w:sz w:val="24"/>
+          <w:szCs w:val="24"/>
+        </w:rPr>
+      </w:pPr>
+      <w:r>
+        <w:rPr>
+          <w:rFonts w:ascii="Times New Roman" w:hAnsi="Times New Roman" w:cs="Times New Roman"/>
+          <w:color w:val="000000" w:themeColor="text1"/>
+          <w:sz w:val="24"/>
+          <w:szCs w:val="24"/>
+        </w:rPr>
+        <w:t>Cadastro e gerenciamento de salas</w:t>
+      </w:r>
+    </w:p>
+    <w:p>
+      <w:pPr>
+        <w:spacing w:line="360" w:lineRule="auto"/>
+        <w:ind w:firstLine="709"/>
+        <w:jc w:val="both"/>
+        <w:rPr>
+          <w:rFonts w:ascii="Times New Roman" w:hAnsi="Times New Roman" w:cs="Times New Roman"/>
+          <w:color w:val="000000" w:themeColor="text1"/>
+          <w:sz w:val="24"/>
+          <w:szCs w:val="24"/>
+        </w:rPr>
+      </w:pPr>
+      <w:r>
+        <w:rPr>
+          <w:rFonts w:ascii="Times New Roman" w:hAnsi="Times New Roman" w:cs="Times New Roman"/>
+          <w:color w:val="000000" w:themeColor="text1"/>
+          <w:sz w:val="24"/>
+          <w:szCs w:val="24"/>
+        </w:rPr>
+        <w:t>Reserva de salas</w:t>
+      </w:r>
+    </w:p>
+    <w:p>
+      <w:pPr>
+        <w:spacing w:line="360" w:lineRule="auto"/>
+        <w:ind w:firstLine="709"/>
+        <w:jc w:val="both"/>
+        <w:rPr>
+          <w:rFonts w:ascii="Times New Roman" w:hAnsi="Times New Roman" w:cs="Times New Roman"/>
+          <w:color w:val="000000" w:themeColor="text1"/>
+          <w:sz w:val="24"/>
+          <w:szCs w:val="24"/>
+        </w:rPr>
+      </w:pPr>
+      <w:r>
+        <w:rPr>
+          <w:rFonts w:ascii="Times New Roman" w:hAnsi="Times New Roman" w:cs="Times New Roman"/>
+          <w:color w:val="000000" w:themeColor="text1"/>
+          <w:sz w:val="24"/>
+          <w:szCs w:val="24"/>
+        </w:rPr>
+        <w:t>Validação de conflitos de horários</w:t>
+      </w:r>
+    </w:p>
+    <w:p>
+      <w:pPr>
+        <w:spacing w:line="360" w:lineRule="auto"/>
+        <w:ind w:firstLine="709"/>
+        <w:jc w:val="both"/>
+        <w:rPr>
+          <w:rFonts w:ascii="Times New Roman" w:hAnsi="Times New Roman" w:cs="Times New Roman"/>
+          <w:color w:val="000000" w:themeColor="text1"/>
+          <w:sz w:val="24"/>
+          <w:szCs w:val="24"/>
+        </w:rPr>
+      </w:pPr>
+      <w:r>
+        <w:rPr>
+          <w:rFonts w:ascii="Times New Roman" w:hAnsi="Times New Roman" w:cs="Times New Roman"/>
+          <w:color w:val="000000" w:themeColor="text1"/>
+          <w:sz w:val="24"/>
+          <w:szCs w:val="24"/>
+        </w:rPr>
+        <w:t>Cancelamento e alteração de reservas</w:t>
+      </w:r>
+    </w:p>
+    <w:p>
+      <w:pPr>
+        <w:spacing w:line="360" w:lineRule="auto"/>
+        <w:ind w:firstLine="709"/>
+        <w:jc w:val="both"/>
+        <w:rPr>
+          <w:rFonts w:ascii="Times New Roman" w:hAnsi="Times New Roman" w:cs="Times New Roman"/>
+          <w:color w:val="000000" w:themeColor="text1"/>
+          <w:sz w:val="24"/>
+          <w:szCs w:val="24"/>
+        </w:rPr>
+      </w:pPr>
+      <w:r>
+        <w:rPr>
+          <w:rFonts w:ascii="Times New Roman" w:hAnsi="Times New Roman" w:cs="Times New Roman"/>
+          <w:color w:val="000000" w:themeColor="text1"/>
+          <w:sz w:val="24"/>
+          <w:szCs w:val="24"/>
+        </w:rPr>
+        <w:t>Consulta de reservas</w:t>
+      </w:r>
+    </w:p>
+    <w:p>
+      <w:pPr>
+        <w:spacing w:line="360" w:lineRule="auto"/>
+        <w:ind w:firstLine="709"/>
+        <w:jc w:val="both"/>
+        <w:rPr>
+          <w:rFonts w:ascii="Times New Roman" w:hAnsi="Times New Roman" w:cs="Times New Roman"/>
+          <w:color w:val="000000" w:themeColor="text1"/>
+          <w:sz w:val="24"/>
+          <w:szCs w:val="24"/>
+        </w:rPr>
+      </w:pPr>
+      <w:r>
+        <w:rPr>
+          <w:rFonts w:ascii="Times New Roman" w:hAnsi="Times New Roman" w:cs="Times New Roman"/>
+          <w:color w:val="000000" w:themeColor="text1"/>
+          <w:sz w:val="24"/>
+          <w:szCs w:val="24"/>
+        </w:rPr>
+        <w:t>Geração de relatórios</w:t>
+      </w:r>
+    </w:p>
+    <w:p>
+      <w:pPr>
+        <w:spacing w:line="360" w:lineRule="auto"/>
+        <w:ind w:firstLine="709"/>
+        <w:jc w:val="both"/>
+        <w:rPr>
+          <w:rFonts w:ascii="Times New Roman" w:hAnsi="Times New Roman" w:cs="Times New Roman"/>
+          <w:color w:val="000000" w:themeColor="text1"/>
+          <w:sz w:val="24"/>
+          <w:szCs w:val="24"/>
+        </w:rPr>
+      </w:pPr>
+    </w:p>
+    <w:p>
+      <w:pPr>
+        <w:spacing w:line="360" w:lineRule="auto"/>
+        <w:ind w:firstLine="709"/>
+        <w:jc w:val="both"/>
+        <w:rPr>
+          <w:rFonts w:ascii="Times New Roman" w:hAnsi="Times New Roman" w:cs="Times New Roman"/>
+          <w:color w:val="000000" w:themeColor="text1"/>
+          <w:sz w:val="24"/>
+          <w:szCs w:val="24"/>
+        </w:rPr>
+      </w:pPr>
+      <w:r>
+        <w:rPr>
+          <w:rFonts w:ascii="Times New Roman" w:hAnsi="Times New Roman" w:cs="Times New Roman"/>
+          <w:color w:val="000000" w:themeColor="text1"/>
+          <w:sz w:val="24"/>
+          <w:szCs w:val="24"/>
+        </w:rPr>
+        <w:t>Foram adotados os seguintes tipos de testes:</w:t>
+      </w:r>
+    </w:p>
+    <w:p>
+      <w:pPr>
+        <w:spacing w:line="360" w:lineRule="auto"/>
+        <w:ind w:firstLine="709"/>
+        <w:jc w:val="both"/>
+        <w:rPr>
+          <w:rFonts w:ascii="Times New Roman" w:hAnsi="Times New Roman" w:cs="Times New Roman"/>
+          <w:color w:val="000000" w:themeColor="text1"/>
+          <w:sz w:val="24"/>
+          <w:szCs w:val="24"/>
+        </w:rPr>
+      </w:pPr>
+      <w:r>
+        <w:rPr>
+          <w:rFonts w:ascii="Times New Roman" w:hAnsi="Times New Roman" w:cs="Times New Roman"/>
+          <w:color w:val="000000" w:themeColor="text1"/>
+          <w:sz w:val="24"/>
+          <w:szCs w:val="24"/>
+        </w:rPr>
+        <w:t>Testes Unitários: Aplicados às camadas de serviço do sistema, validando regras de negócio individualmente.</w:t>
+      </w:r>
+    </w:p>
+    <w:p>
+      <w:pPr>
+        <w:spacing w:line="360" w:lineRule="auto"/>
+        <w:ind w:firstLine="709"/>
+        <w:jc w:val="both"/>
+        <w:rPr>
+          <w:rFonts w:ascii="Times New Roman" w:hAnsi="Times New Roman" w:cs="Times New Roman"/>
+          <w:color w:val="000000" w:themeColor="text1"/>
+          <w:sz w:val="24"/>
+          <w:szCs w:val="24"/>
+        </w:rPr>
+      </w:pPr>
+      <w:r>
+        <w:rPr>
+          <w:rFonts w:ascii="Times New Roman" w:hAnsi="Times New Roman" w:cs="Times New Roman"/>
+          <w:color w:val="000000" w:themeColor="text1"/>
+          <w:sz w:val="24"/>
+          <w:szCs w:val="24"/>
+        </w:rPr>
+        <w:t>Testes Funcionais: Baseados nos requisitos funcionais, verificando se o sistema atende às funcionalidades esperadas.</w:t>
+      </w:r>
+    </w:p>
+    <w:p>
+      <w:pPr>
+        <w:spacing w:line="360" w:lineRule="auto"/>
+        <w:ind w:firstLine="709"/>
+        <w:jc w:val="both"/>
+        <w:rPr>
+          <w:rFonts w:ascii="Times New Roman" w:hAnsi="Times New Roman" w:cs="Times New Roman"/>
+          <w:color w:val="000000" w:themeColor="text1"/>
+          <w:sz w:val="24"/>
+          <w:szCs w:val="24"/>
+        </w:rPr>
+      </w:pPr>
+    </w:p>
+    <w:p>
+      <w:pPr>
+        <w:spacing w:line="360" w:lineRule="auto"/>
+        <w:ind w:firstLine="709"/>
+        <w:jc w:val="both"/>
+        <w:rPr>
+          <w:rFonts w:ascii="Times New Roman" w:hAnsi="Times New Roman" w:cs="Times New Roman"/>
+          <w:b/>
+          <w:bCs/>
+          <w:color w:val="000000" w:themeColor="text1"/>
+          <w:sz w:val="24"/>
+          <w:szCs w:val="24"/>
+        </w:rPr>
+      </w:pPr>
+      <w:r>
+        <w:rPr>
+          <w:rFonts w:ascii="Times New Roman" w:hAnsi="Times New Roman" w:cs="Times New Roman"/>
+          <w:b/>
+          <w:bCs/>
+          <w:color w:val="000000" w:themeColor="text1"/>
+          <w:sz w:val="24"/>
+          <w:szCs w:val="24"/>
+        </w:rPr>
+        <w:lastRenderedPageBreak/>
+        <w:t>Casos de Teste</w:t>
+      </w:r>
+    </w:p>
+    <w:p>
+      <w:pPr>
+        <w:spacing w:line="360" w:lineRule="auto"/>
+        <w:ind w:firstLine="709"/>
+        <w:jc w:val="both"/>
+        <w:rPr>
+          <w:rFonts w:ascii="Times New Roman" w:hAnsi="Times New Roman" w:cs="Times New Roman"/>
+          <w:color w:val="000000" w:themeColor="text1"/>
+          <w:sz w:val="24"/>
+          <w:szCs w:val="24"/>
+        </w:rPr>
+      </w:pPr>
+    </w:p>
+    <w:p>
+      <w:pPr>
+        <w:spacing w:line="360" w:lineRule="auto"/>
+        <w:ind w:firstLine="709"/>
+        <w:jc w:val="both"/>
+        <w:rPr>
+          <w:rFonts w:ascii="Times New Roman" w:hAnsi="Times New Roman" w:cs="Times New Roman"/>
+          <w:color w:val="000000" w:themeColor="text1"/>
+          <w:sz w:val="24"/>
+          <w:szCs w:val="24"/>
+        </w:rPr>
+      </w:pPr>
+      <w:r>
+        <w:rPr>
+          <w:rFonts w:ascii="Times New Roman" w:hAnsi="Times New Roman" w:cs="Times New Roman"/>
+          <w:color w:val="000000" w:themeColor="text1"/>
+          <w:sz w:val="24"/>
+          <w:szCs w:val="24"/>
+        </w:rPr>
+        <w:t>Os casos de teste foram elaborados com base nos requisitos funcionais do sistema, com o objetivo de validar o comportamento das principais funcionalidades em diferentes cenários de uso, incluindo situações válidas e inválidas.</w:t>
+      </w:r>
+    </w:p>
+    <w:p>
+      <w:pPr>
+        <w:spacing w:line="360" w:lineRule="auto"/>
+        <w:ind w:firstLine="709"/>
+        <w:jc w:val="both"/>
+        <w:rPr>
+          <w:rFonts w:ascii="Times New Roman" w:hAnsi="Times New Roman" w:cs="Times New Roman"/>
+          <w:color w:val="000000" w:themeColor="text1"/>
+          <w:sz w:val="24"/>
+          <w:szCs w:val="24"/>
+        </w:rPr>
+      </w:pPr>
+      <w:r>
+        <w:rPr>
+          <w:rFonts w:ascii="Times New Roman" w:hAnsi="Times New Roman" w:cs="Times New Roman"/>
+          <w:color w:val="000000" w:themeColor="text1"/>
+          <w:sz w:val="24"/>
+          <w:szCs w:val="24"/>
+        </w:rPr>
+        <w:t>No processo de cadastro de salas, foram definidos testes para verificar a inclusão de uma nova sala com dados válidos, garantindo que o sistema armazene corretamente as informações fornecidas. Também foram considerados cenários de entrada inválida, nos quais o sistema deve impedir o cadastro e apresentar mensagens de erro apropriadas, assegurando a integridade dos dados.</w:t>
+      </w:r>
+    </w:p>
+    <w:p>
+      <w:pPr>
+        <w:spacing w:line="360" w:lineRule="auto"/>
+        <w:ind w:firstLine="709"/>
+        <w:jc w:val="both"/>
+        <w:rPr>
+          <w:rFonts w:ascii="Times New Roman" w:hAnsi="Times New Roman" w:cs="Times New Roman"/>
+          <w:color w:val="000000" w:themeColor="text1"/>
+          <w:sz w:val="24"/>
+          <w:szCs w:val="24"/>
+        </w:rPr>
+      </w:pPr>
+      <w:r>
+        <w:rPr>
+          <w:rFonts w:ascii="Times New Roman" w:hAnsi="Times New Roman" w:cs="Times New Roman"/>
+          <w:color w:val="000000" w:themeColor="text1"/>
+          <w:sz w:val="24"/>
+          <w:szCs w:val="24"/>
+        </w:rPr>
+        <w:t>Para a funcionalidade de reserva de salas, os testes contemplam a realização de reservas em horários disponíveis, validando o fluxo normal de uso do sistema. Além disso, foram definidos casos para tentativa de reserva em horários já ocupados, com o objetivo de garantir que o sistema impeça conflitos de agendamento, conforme estabelecido nas regras de negócio. Esse conjunto de testes é essencial para assegurar a confiabilidade do sistema na gestão de reservas.</w:t>
+      </w:r>
+    </w:p>
+    <w:p>
+      <w:pPr>
+        <w:spacing w:line="360" w:lineRule="auto"/>
+        <w:ind w:firstLine="709"/>
+        <w:jc w:val="both"/>
+        <w:rPr>
+          <w:rFonts w:ascii="Times New Roman" w:hAnsi="Times New Roman" w:cs="Times New Roman"/>
+          <w:color w:val="000000" w:themeColor="text1"/>
+          <w:sz w:val="24"/>
+          <w:szCs w:val="24"/>
+        </w:rPr>
+      </w:pPr>
+      <w:r>
+        <w:rPr>
+          <w:rFonts w:ascii="Times New Roman" w:hAnsi="Times New Roman" w:cs="Times New Roman"/>
+          <w:color w:val="000000" w:themeColor="text1"/>
+          <w:sz w:val="24"/>
+          <w:szCs w:val="24"/>
+        </w:rPr>
+        <w:t>No que se refere ao cancelamento de reservas, foram considerados cenários em que o cancelamento ocorre dentro do prazo permitido, verificando se a operação é realizada com sucesso e se o sistema atualiza corretamente o estado da reserva. Também podem ser avaliadas situações em que o cancelamento não é permitido, garantindo que as regras definidas sejam respeitadas.</w:t>
+      </w:r>
+    </w:p>
+    <w:p>
+      <w:pPr>
+        <w:spacing w:line="360" w:lineRule="auto"/>
+        <w:ind w:firstLine="709"/>
+        <w:jc w:val="both"/>
+        <w:rPr>
+          <w:rFonts w:ascii="Times New Roman" w:hAnsi="Times New Roman" w:cs="Times New Roman"/>
+          <w:color w:val="000000" w:themeColor="text1"/>
+          <w:sz w:val="24"/>
+          <w:szCs w:val="24"/>
+        </w:rPr>
+      </w:pPr>
+      <w:r>
+        <w:rPr>
+          <w:rFonts w:ascii="Times New Roman" w:hAnsi="Times New Roman" w:cs="Times New Roman"/>
+          <w:color w:val="000000" w:themeColor="text1"/>
+          <w:sz w:val="24"/>
+          <w:szCs w:val="24"/>
+        </w:rPr>
+        <w:t>Para a funcionalidade de consulta, os testes verificam se o sistema retorna corretamente a lista de reservas associadas ao usuário, garantindo que as informações sejam exibidas de forma clara, consistente e atualizada. Esse tipo de teste assegura a transparência e a confiabilidade das informações apresentadas ao usuário.</w:t>
+      </w:r>
+    </w:p>
+    <w:p>
+      <w:pPr>
+        <w:spacing w:line="360" w:lineRule="auto"/>
+        <w:ind w:firstLine="709"/>
+        <w:jc w:val="both"/>
+        <w:rPr>
+          <w:rFonts w:ascii="Times New Roman" w:hAnsi="Times New Roman" w:cs="Times New Roman"/>
+          <w:color w:val="000000" w:themeColor="text1"/>
+          <w:sz w:val="24"/>
+          <w:szCs w:val="24"/>
+        </w:rPr>
+      </w:pPr>
+      <w:r>
+        <w:rPr>
+          <w:rFonts w:ascii="Times New Roman" w:hAnsi="Times New Roman" w:cs="Times New Roman"/>
+          <w:color w:val="000000" w:themeColor="text1"/>
+          <w:sz w:val="24"/>
+          <w:szCs w:val="24"/>
+        </w:rPr>
+        <w:t>Na parte de autenticação, foram definidos testes para validar o acesso ao sistema com credenciais válidas, garantindo que o usuário consiga realizar login corretamente. Também foram considerados cenários com credenciais inválidas, nos quais o sistema deve negar o acesso e apresentar mensagens de erro adequadas, reforçando a segurança da aplicação.</w:t>
+      </w:r>
+    </w:p>
+    <w:p>
+      <w:pPr>
+        <w:spacing w:line="360" w:lineRule="auto"/>
+        <w:ind w:firstLine="709"/>
+        <w:jc w:val="both"/>
+        <w:rPr>
+          <w:rFonts w:ascii="Times New Roman" w:hAnsi="Times New Roman" w:cs="Times New Roman"/>
+          <w:color w:val="000000" w:themeColor="text1"/>
+          <w:sz w:val="24"/>
+          <w:szCs w:val="24"/>
+        </w:rPr>
+      </w:pPr>
+      <w:r>
+        <w:rPr>
+          <w:rFonts w:ascii="Times New Roman" w:hAnsi="Times New Roman" w:cs="Times New Roman"/>
+          <w:color w:val="000000" w:themeColor="text1"/>
+          <w:sz w:val="24"/>
+          <w:szCs w:val="24"/>
+        </w:rPr>
+        <w:lastRenderedPageBreak/>
+        <w:t>De forma geral, os casos de teste foram projetados para cobrir os principais fluxos do sistema, validando tanto comportamentos esperados quanto situações de erro, contribuindo para a garantia da qualidade e confiabilidade do Sistema de Reserva de Salas.</w:t>
+      </w:r>
+    </w:p>
+    <w:p>
+      <w:pPr>
+        <w:spacing w:line="360" w:lineRule="auto"/>
+        <w:ind w:firstLine="709"/>
+        <w:jc w:val="both"/>
+        <w:rPr>
+          <w:rFonts w:ascii="Times New Roman" w:hAnsi="Times New Roman" w:cs="Times New Roman"/>
+          <w:b/>
+          <w:bCs/>
+          <w:color w:val="000000" w:themeColor="text1"/>
+          <w:sz w:val="24"/>
+          <w:szCs w:val="24"/>
+        </w:rPr>
+      </w:pPr>
+    </w:p>
+    <w:p>
+      <w:pPr>
+        <w:spacing w:line="360" w:lineRule="auto"/>
+        <w:ind w:firstLine="709"/>
+        <w:jc w:val="both"/>
+        <w:rPr>
+          <w:rFonts w:ascii="Times New Roman" w:hAnsi="Times New Roman" w:cs="Times New Roman"/>
+          <w:b/>
+          <w:bCs/>
+          <w:color w:val="000000" w:themeColor="text1"/>
+          <w:sz w:val="24"/>
+          <w:szCs w:val="24"/>
+        </w:rPr>
+      </w:pPr>
+      <w:r>
+        <w:rPr>
+          <w:rFonts w:ascii="Times New Roman" w:hAnsi="Times New Roman" w:cs="Times New Roman"/>
+          <w:b/>
+          <w:bCs/>
+          <w:color w:val="000000" w:themeColor="text1"/>
+          <w:sz w:val="24"/>
+          <w:szCs w:val="24"/>
+        </w:rPr>
+        <w:t>Implementação dos Testes</w:t>
+      </w:r>
+    </w:p>
+    <w:p>
+      <w:pPr>
+        <w:spacing w:line="360" w:lineRule="auto"/>
+        <w:ind w:firstLine="709"/>
+        <w:jc w:val="both"/>
+        <w:rPr>
+          <w:rFonts w:ascii="Times New Roman" w:hAnsi="Times New Roman" w:cs="Times New Roman"/>
+          <w:color w:val="000000" w:themeColor="text1"/>
+          <w:sz w:val="24"/>
+          <w:szCs w:val="24"/>
+        </w:rPr>
+      </w:pPr>
+    </w:p>
+    <w:p>
+      <w:pPr>
+        <w:spacing w:line="360" w:lineRule="auto"/>
+        <w:ind w:firstLine="709"/>
+        <w:jc w:val="both"/>
+        <w:rPr>
+          <w:rFonts w:ascii="Times New Roman" w:hAnsi="Times New Roman" w:cs="Times New Roman"/>
+          <w:color w:val="000000" w:themeColor="text1"/>
+          <w:sz w:val="24"/>
+          <w:szCs w:val="24"/>
+        </w:rPr>
+      </w:pPr>
+      <w:r>
+        <w:rPr>
+          <w:rFonts w:ascii="Times New Roman" w:hAnsi="Times New Roman" w:cs="Times New Roman"/>
+          <w:color w:val="000000" w:themeColor="text1"/>
+          <w:sz w:val="24"/>
+          <w:szCs w:val="24"/>
+        </w:rPr>
+        <w:t xml:space="preserve">A implementação dos testes foi realizada utilizando a ferramenta </w:t>
+      </w:r>
+      <w:proofErr w:type="spellStart"/>
+      <w:r>
+        <w:rPr>
+          <w:rFonts w:ascii="Times New Roman" w:hAnsi="Times New Roman" w:cs="Times New Roman"/>
+          <w:color w:val="000000" w:themeColor="text1"/>
+          <w:sz w:val="24"/>
+          <w:szCs w:val="24"/>
+        </w:rPr>
+        <w:t>JUnit</w:t>
+      </w:r>
+      <w:proofErr w:type="spellEnd"/>
+      <w:r>
+        <w:rPr>
+          <w:rFonts w:ascii="Times New Roman" w:hAnsi="Times New Roman" w:cs="Times New Roman"/>
+          <w:color w:val="000000" w:themeColor="text1"/>
+          <w:sz w:val="24"/>
+          <w:szCs w:val="24"/>
+        </w:rPr>
+        <w:t>, amplamente utilizada para testes unitários em aplicações Java.</w:t>
+      </w:r>
+    </w:p>
+    <w:p>
+      <w:pPr>
+        <w:spacing w:line="360" w:lineRule="auto"/>
+        <w:ind w:firstLine="709"/>
+        <w:jc w:val="both"/>
+        <w:rPr>
+          <w:rFonts w:ascii="Times New Roman" w:hAnsi="Times New Roman" w:cs="Times New Roman"/>
+          <w:color w:val="000000" w:themeColor="text1"/>
+          <w:sz w:val="24"/>
+          <w:szCs w:val="24"/>
+        </w:rPr>
+      </w:pPr>
+      <w:r>
+        <w:rPr>
+          <w:rFonts w:ascii="Times New Roman" w:hAnsi="Times New Roman" w:cs="Times New Roman"/>
+          <w:color w:val="000000" w:themeColor="text1"/>
+          <w:sz w:val="24"/>
+          <w:szCs w:val="24"/>
+        </w:rPr>
+        <w:t>Os testes foram aplicados principalmente nas camadas de serviço do sistema, como:</w:t>
+      </w:r>
+    </w:p>
+    <w:p>
+      <w:pPr>
+        <w:spacing w:line="360" w:lineRule="auto"/>
+        <w:ind w:firstLine="709"/>
+        <w:jc w:val="both"/>
+        <w:rPr>
+          <w:rFonts w:ascii="Times New Roman" w:hAnsi="Times New Roman" w:cs="Times New Roman"/>
+          <w:color w:val="000000" w:themeColor="text1"/>
+          <w:sz w:val="24"/>
+          <w:szCs w:val="24"/>
+        </w:rPr>
+      </w:pPr>
+      <w:r>
+        <w:rPr>
+          <w:rFonts w:ascii="Times New Roman" w:hAnsi="Times New Roman" w:cs="Times New Roman"/>
+          <w:color w:val="000000" w:themeColor="text1"/>
+          <w:sz w:val="24"/>
+          <w:szCs w:val="24"/>
+        </w:rPr>
+        <w:t>Serviço de gerenciamento de salas</w:t>
+      </w:r>
+    </w:p>
+    <w:p>
+      <w:pPr>
+        <w:spacing w:line="360" w:lineRule="auto"/>
+        <w:ind w:firstLine="709"/>
+        <w:jc w:val="both"/>
+        <w:rPr>
+          <w:rFonts w:ascii="Times New Roman" w:hAnsi="Times New Roman" w:cs="Times New Roman"/>
+          <w:color w:val="000000" w:themeColor="text1"/>
+          <w:sz w:val="24"/>
+          <w:szCs w:val="24"/>
+        </w:rPr>
+      </w:pPr>
+      <w:r>
+        <w:rPr>
+          <w:rFonts w:ascii="Times New Roman" w:hAnsi="Times New Roman" w:cs="Times New Roman"/>
+          <w:color w:val="000000" w:themeColor="text1"/>
+          <w:sz w:val="24"/>
+          <w:szCs w:val="24"/>
+        </w:rPr>
+        <w:t>Serviço de reservas</w:t>
+      </w:r>
+    </w:p>
+    <w:p>
+      <w:pPr>
+        <w:spacing w:line="360" w:lineRule="auto"/>
+        <w:ind w:firstLine="709"/>
+        <w:jc w:val="both"/>
+        <w:rPr>
+          <w:rFonts w:ascii="Times New Roman" w:hAnsi="Times New Roman" w:cs="Times New Roman"/>
+          <w:color w:val="000000" w:themeColor="text1"/>
+          <w:sz w:val="24"/>
+          <w:szCs w:val="24"/>
+        </w:rPr>
+      </w:pPr>
+      <w:r>
+        <w:rPr>
+          <w:rFonts w:ascii="Times New Roman" w:hAnsi="Times New Roman" w:cs="Times New Roman"/>
+          <w:color w:val="000000" w:themeColor="text1"/>
+          <w:sz w:val="24"/>
+          <w:szCs w:val="24"/>
+        </w:rPr>
+        <w:t>Serviço de autenticação</w:t>
+      </w:r>
+    </w:p>
+    <w:p>
+      <w:pPr>
+        <w:spacing w:line="360" w:lineRule="auto"/>
+        <w:ind w:firstLine="709"/>
+        <w:jc w:val="both"/>
+        <w:rPr>
+          <w:rFonts w:ascii="Times New Roman" w:hAnsi="Times New Roman" w:cs="Times New Roman"/>
+          <w:color w:val="000000" w:themeColor="text1"/>
+          <w:sz w:val="24"/>
+          <w:szCs w:val="24"/>
+        </w:rPr>
+      </w:pPr>
+    </w:p>
+    <w:p>
+      <w:pPr>
+        <w:spacing w:line="360" w:lineRule="auto"/>
+        <w:ind w:firstLine="709"/>
+        <w:jc w:val="both"/>
+        <w:rPr>
+          <w:rFonts w:ascii="Times New Roman" w:hAnsi="Times New Roman" w:cs="Times New Roman"/>
+          <w:color w:val="000000" w:themeColor="text1"/>
+          <w:sz w:val="24"/>
+          <w:szCs w:val="24"/>
+        </w:rPr>
+      </w:pPr>
+      <w:r>
+        <w:rPr>
+          <w:rFonts w:ascii="Times New Roman" w:hAnsi="Times New Roman" w:cs="Times New Roman"/>
+          <w:color w:val="000000" w:themeColor="text1"/>
+          <w:sz w:val="24"/>
+          <w:szCs w:val="24"/>
+        </w:rPr>
+        <w:t>Esses testes validam as regras de negócio, como verificação de conflitos de horário, validação de dados e controle de operações, garantindo que cada funcionalidade funcione de forma isolada e correta.</w:t>
+      </w:r>
+    </w:p>
+    <w:p>
+      <w:pPr>
+        <w:spacing w:line="360" w:lineRule="auto"/>
+        <w:ind w:firstLine="709"/>
+        <w:jc w:val="both"/>
+        <w:rPr>
+          <w:rFonts w:ascii="Times New Roman" w:hAnsi="Times New Roman" w:cs="Times New Roman"/>
+          <w:color w:val="000000" w:themeColor="text1"/>
+          <w:sz w:val="24"/>
+          <w:szCs w:val="24"/>
+        </w:rPr>
+      </w:pPr>
+    </w:p>
+    <w:p>
+      <w:pPr>
+        <w:spacing w:line="360" w:lineRule="auto"/>
+        <w:ind w:firstLine="709"/>
+        <w:jc w:val="both"/>
+        <w:rPr>
+          <w:rFonts w:ascii="Times New Roman" w:hAnsi="Times New Roman" w:cs="Times New Roman"/>
+          <w:b/>
+          <w:bCs/>
+          <w:color w:val="000000" w:themeColor="text1"/>
+          <w:sz w:val="24"/>
+          <w:szCs w:val="24"/>
+        </w:rPr>
+      </w:pPr>
+      <w:r>
+        <w:rPr>
+          <w:rFonts w:ascii="Times New Roman" w:hAnsi="Times New Roman" w:cs="Times New Roman"/>
+          <w:b/>
+          <w:bCs/>
+          <w:color w:val="000000" w:themeColor="text1"/>
+          <w:sz w:val="24"/>
+          <w:szCs w:val="24"/>
+        </w:rPr>
+        <w:t>Execução dos Testes</w:t>
+      </w:r>
+    </w:p>
+    <w:p>
+      <w:pPr>
+        <w:spacing w:line="360" w:lineRule="auto"/>
+        <w:ind w:firstLine="709"/>
+        <w:jc w:val="both"/>
+        <w:rPr>
+          <w:rFonts w:ascii="Times New Roman" w:hAnsi="Times New Roman" w:cs="Times New Roman"/>
+          <w:color w:val="000000" w:themeColor="text1"/>
+          <w:sz w:val="24"/>
+          <w:szCs w:val="24"/>
+        </w:rPr>
+      </w:pPr>
+    </w:p>
+    <w:p>
+      <w:pPr>
+        <w:spacing w:line="360" w:lineRule="auto"/>
+        <w:ind w:firstLine="709"/>
+        <w:jc w:val="both"/>
+        <w:rPr>
+          <w:rFonts w:ascii="Times New Roman" w:hAnsi="Times New Roman" w:cs="Times New Roman"/>
+          <w:color w:val="000000" w:themeColor="text1"/>
+          <w:sz w:val="24"/>
+          <w:szCs w:val="24"/>
+        </w:rPr>
+      </w:pPr>
+      <w:r>
+        <w:rPr>
+          <w:rFonts w:ascii="Times New Roman" w:hAnsi="Times New Roman" w:cs="Times New Roman"/>
+          <w:color w:val="000000" w:themeColor="text1"/>
+          <w:sz w:val="24"/>
+          <w:szCs w:val="24"/>
+        </w:rPr>
+        <w:t>A execução dos testes foi realizada durante a fase de desenvolvimento, permitindo a identificação e correção de falhas de forma contínua.</w:t>
+      </w:r>
+    </w:p>
+    <w:p>
+      <w:pPr>
+        <w:spacing w:line="360" w:lineRule="auto"/>
+        <w:ind w:firstLine="709"/>
+        <w:jc w:val="both"/>
+        <w:rPr>
+          <w:rFonts w:ascii="Times New Roman" w:hAnsi="Times New Roman" w:cs="Times New Roman"/>
+          <w:color w:val="000000" w:themeColor="text1"/>
+          <w:sz w:val="24"/>
+          <w:szCs w:val="24"/>
+        </w:rPr>
+      </w:pPr>
+    </w:p>
+    <w:p>
+      <w:pPr>
+        <w:spacing w:line="360" w:lineRule="auto"/>
+        <w:ind w:firstLine="709"/>
+        <w:jc w:val="both"/>
+        <w:rPr>
+          <w:rFonts w:ascii="Times New Roman" w:hAnsi="Times New Roman" w:cs="Times New Roman"/>
+          <w:b/>
+          <w:bCs/>
+          <w:color w:val="000000" w:themeColor="text1"/>
+          <w:sz w:val="24"/>
+          <w:szCs w:val="24"/>
+        </w:rPr>
+      </w:pPr>
+      <w:r>
+        <w:rPr>
+          <w:rFonts w:ascii="Times New Roman" w:hAnsi="Times New Roman" w:cs="Times New Roman"/>
+          <w:b/>
+          <w:bCs/>
+          <w:color w:val="000000" w:themeColor="text1"/>
+          <w:sz w:val="24"/>
+          <w:szCs w:val="24"/>
+        </w:rPr>
+        <w:t>Análise dos Resultados</w:t>
+      </w:r>
+    </w:p>
+    <w:p>
+      <w:pPr>
+        <w:spacing w:line="360" w:lineRule="auto"/>
+        <w:ind w:firstLine="709"/>
+        <w:jc w:val="both"/>
+        <w:rPr>
+          <w:rFonts w:ascii="Times New Roman" w:hAnsi="Times New Roman" w:cs="Times New Roman"/>
+          <w:color w:val="000000" w:themeColor="text1"/>
+          <w:sz w:val="24"/>
+          <w:szCs w:val="24"/>
+        </w:rPr>
+      </w:pPr>
+    </w:p>
+    <w:p>
+      <w:pPr>
+        <w:spacing w:line="360" w:lineRule="auto"/>
+        <w:ind w:firstLine="709"/>
+        <w:jc w:val="both"/>
+        <w:rPr>
+          <w:rFonts w:ascii="Times New Roman" w:hAnsi="Times New Roman" w:cs="Times New Roman"/>
+          <w:color w:val="000000" w:themeColor="text1"/>
+          <w:sz w:val="24"/>
+          <w:szCs w:val="24"/>
+        </w:rPr>
+      </w:pPr>
+      <w:r>
+        <w:rPr>
+          <w:rFonts w:ascii="Times New Roman" w:hAnsi="Times New Roman" w:cs="Times New Roman"/>
+          <w:color w:val="000000" w:themeColor="text1"/>
+          <w:sz w:val="24"/>
+          <w:szCs w:val="24"/>
+        </w:rPr>
+        <w:t>A análise dos resultados demonstra que o sistema apresenta um comportamento consistente em relação aos requisitos definidos.</w:t>
+      </w:r>
+    </w:p>
+    <w:p>
+      <w:pPr>
+        <w:spacing w:line="360" w:lineRule="auto"/>
+        <w:ind w:firstLine="709"/>
+        <w:jc w:val="both"/>
+        <w:rPr>
+          <w:rFonts w:ascii="Times New Roman" w:hAnsi="Times New Roman" w:cs="Times New Roman"/>
+          <w:color w:val="000000" w:themeColor="text1"/>
+          <w:sz w:val="24"/>
+          <w:szCs w:val="24"/>
+        </w:rPr>
+      </w:pPr>
+      <w:r>
+        <w:rPr>
+          <w:rFonts w:ascii="Times New Roman" w:hAnsi="Times New Roman" w:cs="Times New Roman"/>
+          <w:color w:val="000000" w:themeColor="text1"/>
+          <w:sz w:val="24"/>
+          <w:szCs w:val="24"/>
+        </w:rPr>
+        <w:lastRenderedPageBreak/>
+        <w:t>Os testes realizados validaram as principais regras de negócio, especialmente no controle de reservas e prevenção de conflitos de horários, que são pontos críticos do sistema.</w:t>
+      </w:r>
+    </w:p>
+    <w:p>
+      <w:pPr>
+        <w:spacing w:line="360" w:lineRule="auto"/>
+        <w:ind w:firstLine="709"/>
+        <w:jc w:val="both"/>
+        <w:rPr>
+          <w:rFonts w:ascii="Times New Roman" w:hAnsi="Times New Roman" w:cs="Times New Roman"/>
+          <w:color w:val="000000" w:themeColor="text1"/>
+          <w:sz w:val="24"/>
+          <w:szCs w:val="24"/>
+        </w:rPr>
+      </w:pPr>
+      <w:r>
+        <w:rPr>
+          <w:rFonts w:ascii="Times New Roman" w:hAnsi="Times New Roman" w:cs="Times New Roman"/>
+          <w:color w:val="000000" w:themeColor="text1"/>
+          <w:sz w:val="24"/>
+          <w:szCs w:val="24"/>
+        </w:rPr>
+        <w:t>A utilização de testes unitários contribuiu para garantir maior confiabilidade e facilitar a manutenção do código, permitindo identificar rapidamente possíveis falhas.</w:t>
+      </w:r>
+    </w:p>
+    <w:p>
+      <w:pPr>
+        <w:spacing w:line="360" w:lineRule="auto"/>
+        <w:ind w:firstLine="709"/>
+        <w:jc w:val="both"/>
+        <w:rPr>
+          <w:rFonts w:ascii="Times New Roman" w:hAnsi="Times New Roman" w:cs="Times New Roman"/>
+          <w:color w:val="000000" w:themeColor="text1"/>
+          <w:sz w:val="24"/>
+          <w:szCs w:val="24"/>
+        </w:rPr>
+      </w:pPr>
+      <w:r>
+        <w:rPr>
+          <w:rFonts w:ascii="Times New Roman" w:hAnsi="Times New Roman" w:cs="Times New Roman"/>
+          <w:color w:val="000000" w:themeColor="text1"/>
+          <w:sz w:val="24"/>
+          <w:szCs w:val="24"/>
+        </w:rPr>
+        <w:t>De forma geral, o sistema mostrou-se estável e apto para utilização, atendendo aos objetivos propostos no projeto. Contudo, recomenda-se a continuidade da execução de testes em futuras evoluções, incluindo testes de integração e testes de desempenho, para garantir ainda mais robustez e escalabilidade.</w:t>
+      </w:r>
+    </w:p>
+    <w:p>
+      <w:pPr>
+        <w:spacing w:line="360" w:lineRule="auto"/>
+        <w:ind w:firstLine="709"/>
+        <w:jc w:val="both"/>
+        <w:rPr>
+          <w:rFonts w:ascii="Times New Roman" w:hAnsi="Times New Roman" w:cs="Times New Roman"/>
+          <w:b/>
+          <w:bCs/>
+          <w:color w:val="000000" w:themeColor="text1"/>
+          <w:sz w:val="24"/>
+          <w:szCs w:val="24"/>
+        </w:rPr>
+      </w:pPr>
+    </w:p>
+    <w:p>
+      <w:pPr>
+        <w:spacing w:line="360" w:lineRule="auto"/>
+        <w:ind w:firstLine="709"/>
+        <w:jc w:val="both"/>
+        <w:rPr>
+          <w:rFonts w:ascii="Times New Roman" w:hAnsi="Times New Roman" w:cs="Times New Roman"/>
+          <w:b/>
+          <w:bCs/>
+          <w:color w:val="000000" w:themeColor="text1"/>
+          <w:sz w:val="24"/>
+          <w:szCs w:val="24"/>
+        </w:rPr>
+      </w:pPr>
+      <w:r>
+        <w:rPr>
+          <w:rFonts w:ascii="Times New Roman" w:hAnsi="Times New Roman" w:cs="Times New Roman"/>
+          <w:b/>
+          <w:bCs/>
+          <w:color w:val="000000" w:themeColor="text1"/>
+          <w:sz w:val="24"/>
+          <w:szCs w:val="24"/>
+        </w:rPr>
         <w:t>CONCLUSÃO</w:t>
       </w:r>
     </w:p>

</xml_diff>